<commit_message>
updated crps and confusion matrix code to fix differently named values
</commit_message>
<xml_diff>
--- a/CRPS_skill_summary.docx
+++ b/CRPS_skill_summary.docx
@@ -4991,7 +4991,7 @@
                 <w:szCs w:val="22"/>
                 <w:color w:val="000000"/>
               </w:rPr>
-              <w:t xml:space="preserve"/>
+              <w:t xml:space="preserve">0.238</w:t>
             </w:r>
           </w:p>
         </w:tc>
@@ -5256,7 +5256,7 @@
                 <w:szCs w:val="22"/>
                 <w:color w:val="000000"/>
               </w:rPr>
-              <w:t xml:space="preserve"/>
+              <w:t xml:space="preserve">0.048</w:t>
             </w:r>
           </w:p>
         </w:tc>
@@ -6566,7 +6566,7 @@
                 <w:szCs w:val="22"/>
                 <w:color w:val="000000"/>
               </w:rPr>
-              <w:t xml:space="preserve"/>
+              <w:t xml:space="preserve">0.248</w:t>
             </w:r>
           </w:p>
         </w:tc>
@@ -6831,7 +6831,7 @@
                 <w:szCs w:val="22"/>
                 <w:color w:val="000000"/>
               </w:rPr>
-              <w:t xml:space="preserve"/>
+              <w:t xml:space="preserve">0.008</w:t>
             </w:r>
           </w:p>
         </w:tc>

</xml_diff>